<commit_message>
Finalize Practical 2: Update complete documentation report, verified repo link, and application screenshots for Manav Lakhani (24CS047)
</commit_message>
<xml_diff>
--- a/pract-2-awdf-24cs047.docx
+++ b/pract-2-awdf-24cs047.docx
@@ -1213,7 +1213,7 @@
               <w:br/>
               <w:t xml:space="preserve">      technologies: ["React", "React Router", "Vite", "CSS3"],</w:t>
               <w:br/>
-              <w:t xml:space="preserve">      repoLink: "https://github.com/24CS047Manav/Awdf-Practical_1"</w:t>
+              <w:t xml:space="preserve">      repoLink: "https://github.com/24CS047Manav/Awdf_Practica_2"</w:t>
               <w:br/>
               <w:t xml:space="preserve">    },</w:t>
               <w:br/>
@@ -1721,23 +1721,8 @@
                 <w:lang w:val="en-IN" w:eastAsia="en-IN"/>
               </w:rPr>
             </w:pPr>
-            <w:r/>
-            <w:r>
-              <w:rPr>
-                <w:rFonts w:ascii="Times New Roman" w:hAnsi="Times New Roman"/>
-                <w:b/>
-                <w:sz w:val="22"/>
-              </w:rPr>
-              <w:t xml:space="preserve">GitHub Link Repository Link: </w:t>
-            </w:r>
-            <w:r>
-              <w:rPr>
-                <w:rFonts w:ascii="Times New Roman" w:hAnsi="Times New Roman"/>
-                <w:b/>
-                <w:color w:val="0000CC"/>
-                <w:sz w:val="22"/>
-              </w:rPr>
-              <w:t>https://github.com/24CS047Manav/Awdf-Practical_1</w:t>
+            <w:r>
+              <w:t>GitHub Link Repository Link: https://github.com/24CS047Manav/Awdf_Practica_2</w:t>
             </w:r>
           </w:p>
           <w:bookmarkEnd w:id="1"/>
@@ -1965,6 +1950,165 @@
                 <w:sz w:val="21"/>
               </w:rPr>
               <w:t>Added a fallback wildcard route ('*') rendering a styled NotFound error component with a return button to the Home route.</w:t>
+            </w:r>
+          </w:p>
+          <w:p>
+            <w:pPr>
+              <w:spacing w:before="240" w:after="80"/>
+            </w:pPr>
+            <w:r>
+              <w:rPr>
+                <w:b/>
+                <w:sz w:val="21"/>
+              </w:rPr>
+              <w:br/>
+              <w:t>Figure 1: Home Page &amp; Navigation (React Router v6)</w:t>
+            </w:r>
+          </w:p>
+          <w:p>
+            <w:pPr>
+              <w:spacing w:after="160"/>
+              <w:jc w:val="center"/>
+            </w:pPr>
+            <w:r>
+              <w:drawing>
+                <wp:inline xmlns:a="http://schemas.openxmlformats.org/drawingml/2006/main" xmlns:pic="http://schemas.openxmlformats.org/drawingml/2006/picture">
+                  <wp:extent cx="5303520" cy="3521869"/>
+                  <wp:docPr id="1" name="Picture 1"/>
+                  <wp:cNvGraphicFramePr>
+                    <a:graphicFrameLocks noChangeAspect="1"/>
+                  </wp:cNvGraphicFramePr>
+                  <a:graphic>
+                    <a:graphicData uri="http://schemas.openxmlformats.org/drawingml/2006/picture">
+                      <pic:pic>
+                        <pic:nvPicPr>
+                          <pic:cNvPr id="0" name="practical_2_home.png"/>
+                          <pic:cNvPicPr/>
+                        </pic:nvPicPr>
+                        <pic:blipFill>
+                          <a:blip r:embed="rId17"/>
+                          <a:stretch>
+                            <a:fillRect/>
+                          </a:stretch>
+                        </pic:blipFill>
+                        <pic:spPr>
+                          <a:xfrm>
+                            <a:off x="0" y="0"/>
+                            <a:ext cx="5303520" cy="3521869"/>
+                          </a:xfrm>
+                          <a:prstGeom prst="rect"/>
+                        </pic:spPr>
+                      </pic:pic>
+                    </a:graphicData>
+                  </a:graphic>
+                </wp:inline>
+              </w:drawing>
+            </w:r>
+          </w:p>
+          <w:p>
+            <w:pPr>
+              <w:spacing w:before="240" w:after="80"/>
+            </w:pPr>
+            <w:r>
+              <w:rPr>
+                <w:b/>
+                <w:sz w:val="21"/>
+              </w:rPr>
+              <w:br/>
+              <w:t>Figure 2: Contact Page with Controlled Form &amp; Live useState State Preview</w:t>
+            </w:r>
+          </w:p>
+          <w:p>
+            <w:pPr>
+              <w:spacing w:after="160"/>
+              <w:jc w:val="center"/>
+            </w:pPr>
+            <w:r>
+              <w:drawing>
+                <wp:inline xmlns:a="http://schemas.openxmlformats.org/drawingml/2006/main" xmlns:pic="http://schemas.openxmlformats.org/drawingml/2006/picture">
+                  <wp:extent cx="5303520" cy="3521869"/>
+                  <wp:docPr id="2" name="Picture 2"/>
+                  <wp:cNvGraphicFramePr>
+                    <a:graphicFrameLocks noChangeAspect="1"/>
+                  </wp:cNvGraphicFramePr>
+                  <a:graphic>
+                    <a:graphicData uri="http://schemas.openxmlformats.org/drawingml/2006/picture">
+                      <pic:pic>
+                        <pic:nvPicPr>
+                          <pic:cNvPr id="0" name="practical_2_contact.png"/>
+                          <pic:cNvPicPr/>
+                        </pic:nvPicPr>
+                        <pic:blipFill>
+                          <a:blip r:embed="rId18"/>
+                          <a:stretch>
+                            <a:fillRect/>
+                          </a:stretch>
+                        </pic:blipFill>
+                        <pic:spPr>
+                          <a:xfrm>
+                            <a:off x="0" y="0"/>
+                            <a:ext cx="5303520" cy="3521869"/>
+                          </a:xfrm>
+                          <a:prstGeom prst="rect"/>
+                        </pic:spPr>
+                      </pic:pic>
+                    </a:graphicData>
+                  </a:graphic>
+                </wp:inline>
+              </w:drawing>
+            </w:r>
+          </w:p>
+          <w:p>
+            <w:pPr>
+              <w:spacing w:before="240" w:after="80"/>
+            </w:pPr>
+            <w:r>
+              <w:rPr>
+                <w:b/>
+                <w:sz w:val="21"/>
+              </w:rPr>
+              <w:br/>
+              <w:t>Figure 3: Dark Mode Theme State Toggle</w:t>
+            </w:r>
+          </w:p>
+          <w:p>
+            <w:pPr>
+              <w:spacing w:after="160"/>
+              <w:jc w:val="center"/>
+            </w:pPr>
+            <w:r>
+              <w:drawing>
+                <wp:inline xmlns:a="http://schemas.openxmlformats.org/drawingml/2006/main" xmlns:pic="http://schemas.openxmlformats.org/drawingml/2006/picture">
+                  <wp:extent cx="5303520" cy="3521869"/>
+                  <wp:docPr id="3" name="Picture 3"/>
+                  <wp:cNvGraphicFramePr>
+                    <a:graphicFrameLocks noChangeAspect="1"/>
+                  </wp:cNvGraphicFramePr>
+                  <a:graphic>
+                    <a:graphicData uri="http://schemas.openxmlformats.org/drawingml/2006/picture">
+                      <pic:pic>
+                        <pic:nvPicPr>
+                          <pic:cNvPr id="0" name="practical_2_dark.png"/>
+                          <pic:cNvPicPr/>
+                        </pic:nvPicPr>
+                        <pic:blipFill>
+                          <a:blip r:embed="rId19"/>
+                          <a:stretch>
+                            <a:fillRect/>
+                          </a:stretch>
+                        </pic:blipFill>
+                        <pic:spPr>
+                          <a:xfrm>
+                            <a:off x="0" y="0"/>
+                            <a:ext cx="5303520" cy="3521869"/>
+                          </a:xfrm>
+                          <a:prstGeom prst="rect"/>
+                        </pic:spPr>
+                      </pic:pic>
+                    </a:graphicData>
+                  </a:graphic>
+                </wp:inline>
+              </w:drawing>
             </w:r>
           </w:p>
         </w:tc>

</xml_diff>